<commit_message>
KZ documents: requisites required by law in every template
Engine: document context gains respondent requisites (name, BIN/IIN, address, e-mail) and field labels
(generic, no country branching). KZ templates rebuilt by scripts/build_kz_templates.py:
- applicant: full name, IIN, postal address, phone (APPK art. 63 p. 2; art. 93 p. 2);
- complaint to a state body: who it is about with BIN and address (Consumer Protection Law art. 42-5 p. 4),
  copies of earlier documents and answers among attachments (art. 42-5 p. 3);
- lawsuit per Civil Procedure Code art. 148-149: plaintiff's date of birth, e-mail, defendant and place of
  residence, claim value, pre-trial steps, copies for defendants, court fee;
- optional lines vanish instead of printing empty requisites; no 'Ответчик' in pre-trial letters.

Co-Authored-By: Claude Opus 5.5 <noreply@anthropic.com>
Claude-Session: https://claude.ai/code/session_013wPF2kqAT2ZFdhGkhDWH2B
</commit_message>
<xml_diff>
--- a/packs/kz/templates/consumer/claim_seller.docx
+++ b/packs/kz/templates/consumer/claim_seller.docx
@@ -11,11 +11,57 @@
       </w:r>
     </w:p>
     <w:p>
+      <w:r>
+        <w:t>{%p if addressee.id %}</w:t>
+      </w:r>
+    </w:p>
+    <w:p>
       <w:pPr>
         <w:jc w:val="right"/>
       </w:pPr>
       <w:r>
-        <w:t>{% if addressee.id %}БИН: {{ addressee.id }}{% endif %}</w:t>
+        <w:t>{{ 'ИИН' if addressee.kind == 'person' else 'БИН' }}: {{ addressee.id }}</w:t>
+      </w:r>
+    </w:p>
+    <w:p>
+      <w:r>
+        <w:t>{%p endif %}</w:t>
+      </w:r>
+    </w:p>
+    <w:p>
+      <w:r>
+        <w:t>{%p if addressee.address %}</w:t>
+      </w:r>
+    </w:p>
+    <w:p>
+      <w:pPr>
+        <w:jc w:val="right"/>
+      </w:pPr>
+      <w:r>
+        <w:t>Адрес: {{ addressee.address }}</w:t>
+      </w:r>
+    </w:p>
+    <w:p>
+      <w:r>
+        <w:t>{%p endif %}</w:t>
+      </w:r>
+    </w:p>
+    <w:p>
+      <w:r>
+        <w:t>{%p if addressee.email %}</w:t>
+      </w:r>
+    </w:p>
+    <w:p>
+      <w:pPr>
+        <w:jc w:val="right"/>
+      </w:pPr>
+      <w:r>
+        <w:t>E-mail: {{ addressee.email }}</w:t>
+      </w:r>
+    </w:p>
+    <w:p>
+      <w:r>
+        <w:t>{%p endif %}</w:t>
       </w:r>
     </w:p>
     <w:p>
@@ -27,11 +73,39 @@
       </w:r>
     </w:p>
     <w:p>
+      <w:r>
+        <w:t>{%p if applicant.id %}</w:t>
+      </w:r>
+    </w:p>
+    <w:p>
       <w:pPr>
         <w:jc w:val="right"/>
       </w:pPr>
       <w:r>
-        <w:t>{% if applicant.id %}ИИН: {{ applicant.id }}{% endif %}</w:t>
+        <w:t>ИИН: {{ applicant.id }}</w:t>
+      </w:r>
+    </w:p>
+    <w:p>
+      <w:r>
+        <w:t>{%p endif %}</w:t>
+      </w:r>
+    </w:p>
+    <w:p>
+      <w:r>
+        <w:t>{%p if applicant.address %}</w:t>
+      </w:r>
+    </w:p>
+    <w:p>
+      <w:pPr>
+        <w:jc w:val="right"/>
+      </w:pPr>
+      <w:r>
+        <w:t>Адрес: {{ applicant.address }}</w:t>
+      </w:r>
+    </w:p>
+    <w:p>
+      <w:r>
+        <w:t>{%p endif %}</w:t>
       </w:r>
     </w:p>
     <w:p>
@@ -40,6 +114,24 @@
       </w:pPr>
       <w:r>
         <w:t>Тел.: {{ f.applicant_phone }}</w:t>
+      </w:r>
+    </w:p>
+    <w:p>
+      <w:r>
+        <w:t>{%p if f.applicant_email %}</w:t>
+      </w:r>
+    </w:p>
+    <w:p>
+      <w:pPr>
+        <w:jc w:val="right"/>
+      </w:pPr>
+      <w:r>
+        <w:t>E-mail: {{ f.applicant_email }}</w:t>
+      </w:r>
+    </w:p>
+    <w:p>
+      <w:r>
+        <w:t>{%p endif %}</w:t>
       </w:r>
     </w:p>
     <w:p>
@@ -121,7 +213,7 @@
     </w:p>
     <w:p>
       <w:r>
-        <w:t>{%p if evidence %}</w:t>
+        <w:t>{%p if evidence or previous_actions %}</w:t>
       </w:r>
     </w:p>
     <w:p>
@@ -137,12 +229,32 @@
     </w:p>
     <w:p>
       <w:r>
+        <w:t>{%p set n = namespace(i=0) %}</w:t>
+      </w:r>
+    </w:p>
+    <w:p>
+      <w:r>
         <w:t>{%p for e in evidence %}</w:t>
       </w:r>
     </w:p>
     <w:p>
       <w:r>
-        <w:t>{{ loop.index }}. {{ e }}</w:t>
+        <w:t>{% set n.i = n.i + 1 %}{{ n.i }}. {{ e }}</w:t>
+      </w:r>
+    </w:p>
+    <w:p>
+      <w:r>
+        <w:t>{%p endfor %}</w:t>
+      </w:r>
+    </w:p>
+    <w:p>
+      <w:r>
+        <w:t>{%p for a in previous_actions %}</w:t>
+      </w:r>
+    </w:p>
+    <w:p>
+      <w:r>
+        <w:t>{% set n.i = n.i + 1 %}{{ n.i }}. Копия документа «{{ a.title }}» от {{ a.date }}{% if a.response %} и ответ на него (или сведения о его отсутствии){% endif %}.</w:t>
       </w:r>
     </w:p>
     <w:p>

</xml_diff>

<commit_message>
Document quality (first paid claim): no client contact as the other side's, no description as an address, names and addresses with capitals, purchase told once, gendered forms resolved (name, surname, id number), services never «бракованный товар», duplicate attachments once, one AI line, amounts with ₸ and in words; admin rebuild applies it
Co-Authored-By: Claude Opus 5.5 <noreply@anthropic.com>
Claude-Session: https://claude.ai/code/session_01Ra4Tt5pojTbvsBrRqGnk8y
</commit_message>
<xml_diff>
--- a/packs/kz/templates/consumer/claim_seller.docx
+++ b/packs/kz/templates/consumer/claim_seller.docx
@@ -157,6 +157,11 @@
       </w:r>
     </w:p>
     <w:p>
+      <w:r>
+        <w:t>{%p if not narrative_tells_purchase %}</w:t>
+      </w:r>
+    </w:p>
+    <w:p>
       <w:pPr>
         <w:jc w:val="both"/>
       </w:pPr>
@@ -164,7 +169,12 @@
         <w:rPr>
           <w:b w:val="0"/>
         </w:rPr>
-        <w:t>{{ f.purchase_date }} мной приобретен(а) «{{ f.goods_description }}» у {{ addressee.name }} на сумму {{ f.amount }} {{ currency }}.</w:t>
+        <w:t>{{ f.purchase_date }} мною была совершена покупка «{{ f.goods_description }}» у {{ addressee.name }} на сумму {{ f.amount }} {{ currency }}.</w:t>
+      </w:r>
+    </w:p>
+    <w:p>
+      <w:r>
+        <w:t>{%p endif %}</w:t>
       </w:r>
     </w:p>
     <w:p>

</xml_diff>

<commit_message>
Official layout per the lawyer's rules (D-23…D-31): A4 25/15/20/20 mm, TNR 14, «Кому» bold on the right, bold title and heading, numbered demands, «Приложение:», date in words, «И. Фамилия», page numbers from page 2 at the top; services → kz.consumer.service_refund (ГК ОсЧ 683, 686, ЗПП 8-1, 42-4; not ЗПП 30); no ID copy, no ИИН in the claim to a seller; only the seller's own published e-mail
Co-Authored-By: Claude Opus 5.5 <noreply@anthropic.com>
Claude-Session: https://claude.ai/code/session_01Ra4Tt5pojTbvsBrRqGnk8y
</commit_message>
<xml_diff>
--- a/packs/kz/templates/consumer/claim_seller.docx
+++ b/packs/kz/templates/consumer/claim_seller.docx
@@ -70,24 +70,6 @@
       </w:pPr>
       <w:r>
         <w:t>От: {{ applicant.name }}</w:t>
-      </w:r>
-    </w:p>
-    <w:p>
-      <w:r>
-        <w:t>{%p if applicant.id %}</w:t>
-      </w:r>
-    </w:p>
-    <w:p>
-      <w:pPr>
-        <w:jc w:val="right"/>
-      </w:pPr>
-      <w:r>
-        <w:t>ИИН: {{ applicant.id }}</w:t>
-      </w:r>
-    </w:p>
-    <w:p>
-      <w:r>
-        <w:t>{%p endif %}</w:t>
       </w:r>
     </w:p>
     <w:p>

</xml_diff>